<commit_message>
docs: simplify 6.3.1 to explain the current mechanism plainly
Rewrote to describe how mean-pooling works today, without contrasting
it against the earlier first-chunk-only approach (already covered in
6.3's own opening paragraph and was causing confusion here). Added a
concrete worked example: three chunks (boilerplate, chunking
strategy, embeddings) averaged into one vector where the boilerplate
is diluted to a third of the signal.
</commit_message>
<xml_diff>
--- a/docs/Technical_Report.docx
+++ b/docs/Technical_Report.docx
@@ -1038,22 +1038,22 @@
         <w:pStyle w:val="Heading3"/>
       </w:pPr>
       <w:r>
-        <w:t>6.3.1 The Fix: Mean-Pooling Every Chunk the Item Already Has</w:t>
+        <w:t>6.3.1 How Mean-Pooling Works</w:t>
       </w:r>
     </w:p>
     <w:p>
       <w:r>
-        <w:t>The candidate-narrowing query vector is now the mean of every chunk embedding the item already has stored in Chroma, not a fresh embedding of anything and not a re-embedding call of any kind. Concretely: every chunk of a document was already individually embedded during ingestion (Section 4.4); the fix fetches all of those already-computed vectors back out of Chroma and averages them, component by component, into a single vector the same length as any one chunk's own embedding. This single averaged vector is what actually gets sent to Chroma as the nearest-neighbor query for finding relationship candidates - the same one-query-per-new-item shape as before, just built from a different, more representative input.</w:t>
+        <w:t>When a new item needs to be checked against the rest of the knowledge base, the system needs one single vector that represents what the whole document is about, not just one piece of it. Every chunk of the document was already given its own embedding during ingestion (Section 4.4), so the system takes all of those chunk vectors and averages them together, number by number, into one new vector of the same length. This averaged vector is what actually gets sent to Chroma as the search query for finding candidates - no new embedding call is needed, since it is built entirely from vectors that already exist.</w:t>
       </w:r>
     </w:p>
     <w:p>
       <w:r>
-        <w:t>This averaging - commonly called mean pooling - is a standard, well-established technique for approximating a whole document's semantic content from its individual pieces' embeddings, and it was chosen specifically because it adds zero new embedding cost: the per-chunk vectors it averages together already exist from the ingestion step that already ran. The alternative that was considered and rejected outright was concatenating a document's full text and sending it through the embedding model as one fresh call. That was rejected because the embedding model itself has a limited input length - a long document's concatenated text would simply get silently truncated by the model before it ever saw the whole thing, reproducing the exact same 'only the beginning of the document actually counts' problem this fix exists to solve, just relocated one level down instead of eliminated.</w:t>
+        <w:t>The same averaging is applied to each candidate Chroma returns as well, using that candidate's own chunks - so the comparison is always whole-document to whole-document, not whole-document to a single chunk on either side.</w:t>
       </w:r>
     </w:p>
     <w:p>
       <w:r>
-        <w:t>One nuance worth stating precisely: mean-pooling is applied on both sides, not just to build the query vector. For each candidate Chroma returns, its own whole-document mean embedding is recomputed too (the same averaging, over that candidate's own chunks) - not left as whichever single chunk vector happened to match in Chroma's index. That candidate-side mean vector is then used to pick which one of the source item's own chunks is most representative to actually send the LLM for judgment, rather than an arbitrary or a fixed chunk. So both the narrowing search itself and the excerpt-selection step that follows it operate on whole-document representations throughout, not whole-document similarity on one side and a single chunk's on the other - an inconsistency that would have reintroduced a milder version of the same first-chunk-dominance problem through the back door if only the initial query vector had been fixed.</w:t>
+        <w:t>Example: suppose a project document has three chunks. The first is mostly boilerplate - a title and a 'Prepared for' line. The second describes a chunking strategy for a RAG pipeline. The third describes generating embeddings through OpenRouter. Averaging all three chunks together produces one vector where the boilerplate is only a third of the signal, and the actual subject matter - chunking and embeddings - makes up the rest. Searching with that averaged vector finds other documents that are also about chunking or embeddings, rather than simply any other document that happens to share the same title formatting.</w:t>
       </w:r>
     </w:p>
     <w:p>

</xml_diff>

<commit_message>
docs: rewrite 6.3.1 as a clear, numbered step-by-step walkthrough
Restructures the explanation into six explicit numbered steps instead
of dense prose paragraphs, leading with the one fact that makes the
rest intuitive: Chroma stores one vector per chunk, never one per
document, so mean-pooling is computed on the fly rather than being
something pre-stored. Walks through, in order: pool the new item's
own chunks, search against everyone else's individual chunk vectors,
collapse duplicate chunk-matches down to distinct candidate items,
then pool each of those few candidates a second time to pick the best
excerpt to show the LLM. Same worked example carried through.
</commit_message>
<xml_diff>
--- a/docs/Technical_Report.docx
+++ b/docs/Technical_Report.docx
@@ -1038,22 +1038,65 @@
         <w:pStyle w:val="Heading3"/>
       </w:pPr>
       <w:r>
-        <w:t>6.3.1 How Mean-Pooling Works</w:t>
+        <w:t>6.3.1 How Mean-Pooling Works, Step by Step</w:t>
       </w:r>
     </w:p>
     <w:p>
       <w:r>
-        <w:t>When a new item needs to be checked against the rest of the knowledge base, the system needs one single vector that represents what the whole document is about, not just one piece of it. Every chunk of the document was already given its own embedding during ingestion (Section 4.4), so the system takes all of those chunk vectors and averages them together, number by number, into one new vector of the same length. This averaged vector is what actually gets sent to Chroma as the search query for finding candidates - no new embedding call is needed, since it is built entirely from vectors that already exist.</w:t>
+        <w:t>Chroma itself never stores one vector per document - it stores one vector per chunk, for every item in the whole knowledge base. Mean-pooling is something computed on the fly, only when needed, not a change to what is stored. The full sequence, for one newly ingested item:</w:t>
+      </w:r>
+    </w:p>
+    <w:p>
+      <w:pPr>
+        <w:pStyle w:val="ListNumber"/>
+      </w:pPr>
+      <w:r>
+        <w:t>The new item already has each of its own chunks individually embedded, from ingestion (Section 4.4).</w:t>
+      </w:r>
+    </w:p>
+    <w:p>
+      <w:pPr>
+        <w:pStyle w:val="ListNumber"/>
+      </w:pPr>
+      <w:r>
+        <w:t>Those chunk vectors are averaged together into one single vector for the whole item. This is the only averaging done before searching.</w:t>
+      </w:r>
+    </w:p>
+    <w:p>
+      <w:pPr>
+        <w:pStyle w:val="ListNumber"/>
+      </w:pPr>
+      <w:r>
+        <w:t>That one averaged vector is used to search Chroma. The search compares it against every other item's individual chunk vectors, not against any pre-averaged vector for those other items - there is no such thing stored anywhere.</w:t>
+      </w:r>
+    </w:p>
+    <w:p>
+      <w:pPr>
+        <w:pStyle w:val="ListNumber"/>
+      </w:pPr>
+      <w:r>
+        <w:t>A document with five chunks has five separate chances to show up as a match, so several of the nearest results often belong to the same other item. Duplicates are collapsed down to a short list of distinct candidate items.</w:t>
+      </w:r>
+    </w:p>
+    <w:p>
+      <w:pPr>
+        <w:pStyle w:val="ListNumber"/>
+      </w:pPr>
+      <w:r>
+        <w:t>For only that short list - not the whole knowledge base - the same averaging happens a second time: each candidate's own chunks are fetched and averaged into its own single vector.</w:t>
+      </w:r>
+    </w:p>
+    <w:p>
+      <w:pPr>
+        <w:pStyle w:val="ListNumber"/>
+      </w:pPr>
+      <w:r>
+        <w:t>That candidate-level average is used to pick which one of the new item's own chunks best matches this specific candidate, so that chunk (not an arbitrary one) is what actually gets shown to the LLM for the yes/no relationship judgment.</w:t>
       </w:r>
     </w:p>
     <w:p>
       <w:r>
-        <w:t>The same averaging is applied to each candidate Chroma returns as well, using that candidate's own chunks - so the comparison is always whole-document to whole-document, not whole-document to a single chunk on either side.</w:t>
-      </w:r>
-    </w:p>
-    <w:p>
-      <w:r>
-        <w:t>Example: suppose a project document has three chunks. The first is mostly boilerplate - a title and a 'Prepared for' line. The second describes a chunking strategy for a RAG pipeline. The third describes generating embeddings through OpenRouter. Averaging all three chunks together produces one vector where the boilerplate is only a third of the signal, and the actual subject matter - chunking and embeddings - makes up the rest. Searching with that averaged vector finds other documents that are also about chunking or embeddings, rather than simply any other document that happens to share the same title formatting.</w:t>
+        <w:t>Example: a project document has three chunks. The first is mostly boilerplate - a title and a 'Prepared for' line. The second describes a chunking strategy for a RAG pipeline. The third describes generating embeddings through OpenRouter. Averaging all three produces one vector where the boilerplate is only a third of the signal and the real subject matter - chunking and embeddings - makes up the rest. Searching with that averaged vector finds other documents that are also about chunking or embeddings, rather than simply any document that happens to share the same title formatting.</w:t>
       </w:r>
     </w:p>
     <w:p>

</xml_diff>